<commit_message>
Rebuild site: Lecture 1 final comments
</commit_message>
<xml_diff>
--- a/en/files/sessions/s1_exercises.docx
+++ b/en/files/sessions/s1_exercises.docx
@@ -613,18 +613,7 @@
         <w:t>The two course papers</w:t>
       </w:r>
       <w:r>
-        <w:t xml:space="preserve"> (in the course folder, </w:t>
-      </w:r>
-      <w:r>
-        <w:rPr>
-          <w:rFonts w:ascii="Consolas" w:hAnsi="Consolas" w:cs="Consolas" w:eastAsia="Consolas"/>
-          <w:color w:val="0B376C"/>
-          <w:sz w:val="19"/>
-        </w:rPr>
-        <w:t>Course/Papers</w:t>
-      </w:r>
-      <w:r>
-        <w:t>):</w:t>
+        <w:t xml:space="preserve"> (PDFs sent by email before Session 1):</w:t>
       </w:r>
     </w:p>
     <w:p>

</xml_diff>